<commit_message>
Taller 1 finalizado y entregado
</commit_message>
<xml_diff>
--- a/Taller_1_DuvierOlmos.docx
+++ b/Taller_1_DuvierOlmos.docx
@@ -1,23 +1,32 @@
 
 <file path=word/document.xml><?xml version="1.0" encoding="utf-8"?>
-<w:document xmlns:wpc="http://schemas.microsoft.com/office/word/2010/wordprocessingCanvas" xmlns:cx="http://schemas.microsoft.com/office/drawing/2014/chartex" xmlns:cx1="http://schemas.microsoft.com/office/drawing/2015/9/8/chartex" xmlns:cx2="http://schemas.microsoft.com/office/drawing/2015/10/21/chartex" xmlns:cx3="http://schemas.microsoft.com/office/drawing/2016/5/9/chartex" xmlns:cx4="http://schemas.microsoft.com/office/drawing/2016/5/10/chartex" xmlns:cx5="http://schemas.microsoft.com/office/drawing/2016/5/11/chartex" xmlns:cx6="http://schemas.microsoft.com/office/drawing/2016/5/12/chartex" xmlns:cx7="http://schemas.microsoft.com/office/drawing/2016/5/13/chartex" xmlns:cx8="http://schemas.microsoft.com/office/drawing/2016/5/14/chartex" xmlns:mc="http://schemas.openxmlformats.org/markup-compatibility/2006" xmlns:aink="http://schemas.microsoft.com/office/drawing/2016/ink" xmlns:am3d="http://schemas.microsoft.com/office/drawing/2017/model3d" xmlns:o="urn:schemas-microsoft-com:office:office" xmlns:oel="http://schemas.microsoft.com/office/2019/extlst" xmlns:r="http://schemas.openxmlformats.org/officeDocument/2006/relationships" xmlns:m="http://schemas.openxmlformats.org/officeDocument/2006/math" xmlns:v="urn:schemas-microsoft-com:vml" xmlns:wp14="http://schemas.microsoft.com/office/word/2010/wordprocessingDrawing" xmlns:wp="http://schemas.openxmlformats.org/drawingml/2006/wordprocessingDrawing" xmlns:w10="urn:schemas-microsoft-com:office:word" xmlns:w="http://schemas.openxmlformats.org/wordprocessingml/2006/main" xmlns:w14="http://schemas.microsoft.com/office/word/2010/wordml" xmlns:w15="http://schemas.microsoft.com/office/word/2012/wordml" xmlns:w16cex="http://schemas.microsoft.com/office/word/2018/wordml/cex" xmlns:w16cid="http://schemas.microsoft.com/office/word/2016/wordml/cid" xmlns:w16="http://schemas.microsoft.com/office/word/2018/wordml" xmlns:w16sdtdh="http://schemas.microsoft.com/office/word/2020/wordml/sdtdatahash" xmlns:w16se="http://schemas.microsoft.com/office/word/2015/wordml/symex" xmlns:wpg="http://schemas.microsoft.com/office/word/2010/wordprocessingGroup" xmlns:wpi="http://schemas.microsoft.com/office/word/2010/wordprocessingInk" xmlns:wne="http://schemas.microsoft.com/office/word/2006/wordml" xmlns:wps="http://schemas.microsoft.com/office/word/2010/wordprocessingShape" mc:Ignorable="w14 w15 w16se w16cid w16 w16cex w16sdtdh wp14">
+<w:document xmlns:wpc="http://schemas.microsoft.com/office/word/2010/wordprocessingCanvas" xmlns:cx="http://schemas.microsoft.com/office/drawing/2014/chartex" xmlns:cx1="http://schemas.microsoft.com/office/drawing/2015/9/8/chartex" xmlns:cx2="http://schemas.microsoft.com/office/drawing/2015/10/21/chartex" xmlns:cx3="http://schemas.microsoft.com/office/drawing/2016/5/9/chartex" xmlns:cx4="http://schemas.microsoft.com/office/drawing/2016/5/10/chartex" xmlns:cx5="http://schemas.microsoft.com/office/drawing/2016/5/11/chartex" xmlns:cx6="http://schemas.microsoft.com/office/drawing/2016/5/12/chartex" xmlns:cx7="http://schemas.microsoft.com/office/drawing/2016/5/13/chartex" xmlns:cx8="http://schemas.microsoft.com/office/drawing/2016/5/14/chartex" xmlns:mc="http://schemas.openxmlformats.org/markup-compatibility/2006" xmlns:aink="http://schemas.microsoft.com/office/drawing/2016/ink" xmlns:am3d="http://schemas.microsoft.com/office/drawing/2017/model3d" xmlns:o="urn:schemas-microsoft-com:office:office" xmlns:oel="http://schemas.microsoft.com/office/2019/extlst" xmlns:r="http://schemas.openxmlformats.org/officeDocument/2006/relationships" xmlns:m="http://schemas.openxmlformats.org/officeDocument/2006/math" xmlns:v="urn:schemas-microsoft-com:vml" xmlns:wp14="http://schemas.microsoft.com/office/word/2010/wordprocessingDrawing" xmlns:wp="http://schemas.openxmlformats.org/drawingml/2006/wordprocessingDrawing" xmlns:w10="urn:schemas-microsoft-com:office:word" xmlns:w="http://schemas.openxmlformats.org/wordprocessingml/2006/main" xmlns:w14="http://schemas.microsoft.com/office/word/2010/wordml" xmlns:w15="http://schemas.microsoft.com/office/word/2012/wordml" xmlns:w16cex="http://schemas.microsoft.com/office/word/2018/wordml/cex" xmlns:w16cid="http://schemas.microsoft.com/office/word/2016/wordml/cid" xmlns:w16="http://schemas.microsoft.com/office/word/2018/wordml" xmlns:w16du="http://schemas.microsoft.com/office/word/2023/wordml/word16du" xmlns:w16sdtdh="http://schemas.microsoft.com/office/word/2020/wordml/sdtdatahash" xmlns:w16sdtfl="http://schemas.microsoft.com/office/word/2024/wordml/sdtformatlock" xmlns:w16se="http://schemas.microsoft.com/office/word/2015/wordml/symex" xmlns:wpg="http://schemas.microsoft.com/office/word/2010/wordprocessingGroup" xmlns:wpi="http://schemas.microsoft.com/office/word/2010/wordprocessingInk" xmlns:wne="http://schemas.microsoft.com/office/word/2006/wordml" xmlns:wps="http://schemas.microsoft.com/office/word/2010/wordprocessingShape" mc:Ignorable="w14 w15 w16se w16cid w16 w16cex w16sdtdh w16sdtfl w16du wp14">
   <w:body>
     <w:p>
       <w:pPr>
         <w:jc w:val="center"/>
+        <w:rPr>
+          <w:rFonts w:eastAsia="Times New Roman" w:cs="Times New Roman"/>
+          <w:szCs w:val="24"/>
+          <w:u w:val="single"/>
+          <w:lang w:eastAsia="es-CO"/>
+        </w:rPr>
+      </w:pPr>
+      <w:r>
         <w:rPr>
           <w:rFonts w:eastAsia="Times New Roman" w:cs="Times New Roman"/>
           <w:szCs w:val="24"/>
           <w:lang w:eastAsia="es-CO"/>
         </w:rPr>
-      </w:pPr>
+        <w:t>Taller 1</w:t>
+      </w:r>
       <w:r>
         <w:rPr>
           <w:rFonts w:eastAsia="Times New Roman" w:cs="Times New Roman"/>
           <w:szCs w:val="24"/>
           <w:lang w:eastAsia="es-CO"/>
         </w:rPr>
-        <w:t>Taller 1</w:t>
+        <w:t>: Informe de Git</w:t>
       </w:r>
     </w:p>
     <w:p>
@@ -46,17 +55,20 @@
         <w:rPr>
           <w:rFonts w:eastAsia="Times New Roman" w:cs="Times New Roman"/>
           <w:szCs w:val="24"/>
+          <w:u w:val="single"/>
           <w:lang w:eastAsia="es-CO"/>
         </w:rPr>
       </w:pPr>
-      <w:r>
+    </w:p>
+    <w:p>
+      <w:pPr>
+        <w:jc w:val="center"/>
         <w:rPr>
           <w:rFonts w:eastAsia="Times New Roman" w:cs="Times New Roman"/>
           <w:szCs w:val="24"/>
           <w:lang w:eastAsia="es-CO"/>
         </w:rPr>
-        <w:t>Duvier Olmos Cometa</w:t>
-      </w:r>
+      </w:pPr>
     </w:p>
     <w:p>
       <w:pPr>
@@ -67,16 +79,14 @@
           <w:lang w:eastAsia="es-CO"/>
         </w:rPr>
       </w:pPr>
-    </w:p>
-    <w:p>
-      <w:pPr>
-        <w:jc w:val="center"/>
+      <w:r>
         <w:rPr>
           <w:rFonts w:eastAsia="Times New Roman" w:cs="Times New Roman"/>
           <w:szCs w:val="24"/>
           <w:lang w:eastAsia="es-CO"/>
         </w:rPr>
-      </w:pPr>
+        <w:t>Duvier Olmos Cometa</w:t>
+      </w:r>
     </w:p>
     <w:p>
       <w:pPr>
@@ -97,14 +107,16 @@
           <w:lang w:eastAsia="es-CO"/>
         </w:rPr>
       </w:pPr>
-      <w:r>
+    </w:p>
+    <w:p>
+      <w:pPr>
+        <w:jc w:val="center"/>
         <w:rPr>
           <w:rFonts w:eastAsia="Times New Roman" w:cs="Times New Roman"/>
           <w:szCs w:val="24"/>
           <w:lang w:eastAsia="es-CO"/>
         </w:rPr>
-        <w:t>Centro de Electricidad, Electrónica y Telecomunicaciones.</w:t>
-      </w:r>
+      </w:pPr>
     </w:p>
     <w:p>
       <w:pPr>
@@ -115,14 +127,16 @@
           <w:lang w:eastAsia="es-CO"/>
         </w:rPr>
       </w:pPr>
-      <w:r>
+    </w:p>
+    <w:p>
+      <w:pPr>
+        <w:jc w:val="center"/>
         <w:rPr>
           <w:rFonts w:eastAsia="Times New Roman" w:cs="Times New Roman"/>
           <w:szCs w:val="24"/>
           <w:lang w:eastAsia="es-CO"/>
         </w:rPr>
-        <w:t>Servicio Nacional De Aprendizaje</w:t>
-      </w:r>
+      </w:pPr>
     </w:p>
     <w:p>
       <w:pPr>
@@ -133,23 +147,23 @@
           <w:lang w:eastAsia="es-CO"/>
         </w:rPr>
       </w:pPr>
-      <w:proofErr w:type="gramStart"/>
-      <w:r>
+    </w:p>
+    <w:p>
+      <w:pPr>
+        <w:jc w:val="center"/>
         <w:rPr>
           <w:rFonts w:eastAsia="Times New Roman" w:cs="Times New Roman"/>
           <w:szCs w:val="24"/>
           <w:lang w:eastAsia="es-CO"/>
         </w:rPr>
-        <w:t>Ficha :</w:t>
-      </w:r>
-      <w:proofErr w:type="gramEnd"/>
+      </w:pPr>
       <w:r>
         <w:rPr>
           <w:rFonts w:eastAsia="Times New Roman" w:cs="Times New Roman"/>
           <w:szCs w:val="24"/>
           <w:lang w:eastAsia="es-CO"/>
         </w:rPr>
-        <w:t xml:space="preserve"> 2996150</w:t>
+        <w:t>Centro de Electricidad, Electrónica y Telecomunicaciones.</w:t>
       </w:r>
     </w:p>
     <w:p>
@@ -161,16 +175,14 @@
           <w:lang w:eastAsia="es-CO"/>
         </w:rPr>
       </w:pPr>
-    </w:p>
-    <w:p>
-      <w:pPr>
-        <w:jc w:val="center"/>
+      <w:r>
         <w:rPr>
           <w:rFonts w:eastAsia="Times New Roman" w:cs="Times New Roman"/>
           <w:szCs w:val="24"/>
           <w:lang w:eastAsia="es-CO"/>
         </w:rPr>
-      </w:pPr>
+        <w:t>Servicio Nacional De Aprendizaje</w:t>
+      </w:r>
     </w:p>
     <w:p>
       <w:pPr>
@@ -181,26 +193,24 @@
           <w:lang w:eastAsia="es-CO"/>
         </w:rPr>
       </w:pPr>
-    </w:p>
-    <w:p>
-      <w:pPr>
-        <w:jc w:val="center"/>
+      <w:proofErr w:type="gramStart"/>
+      <w:r>
         <w:rPr>
           <w:rFonts w:eastAsia="Times New Roman" w:cs="Times New Roman"/>
           <w:szCs w:val="24"/>
           <w:lang w:eastAsia="es-CO"/>
         </w:rPr>
-      </w:pPr>
-    </w:p>
-    <w:p>
-      <w:pPr>
-        <w:jc w:val="center"/>
+        <w:t>Ficha :</w:t>
+      </w:r>
+      <w:proofErr w:type="gramEnd"/>
+      <w:r>
         <w:rPr>
           <w:rFonts w:eastAsia="Times New Roman" w:cs="Times New Roman"/>
           <w:szCs w:val="24"/>
           <w:lang w:eastAsia="es-CO"/>
         </w:rPr>
-      </w:pPr>
+        <w:t xml:space="preserve"> 2996150</w:t>
+      </w:r>
     </w:p>
     <w:p>
       <w:pPr>
@@ -211,30 +221,36 @@
           <w:lang w:eastAsia="es-CO"/>
         </w:rPr>
       </w:pPr>
-      <w:r>
+    </w:p>
+    <w:p>
+      <w:pPr>
+        <w:jc w:val="center"/>
         <w:rPr>
           <w:rFonts w:eastAsia="Times New Roman" w:cs="Times New Roman"/>
           <w:szCs w:val="24"/>
           <w:lang w:eastAsia="es-CO"/>
         </w:rPr>
-        <w:t>Bogotá D.C.</w:t>
-      </w:r>
-      <w:r>
+      </w:pPr>
+    </w:p>
+    <w:p>
+      <w:pPr>
+        <w:jc w:val="center"/>
         <w:rPr>
           <w:rFonts w:eastAsia="Times New Roman" w:cs="Times New Roman"/>
           <w:szCs w:val="24"/>
           <w:lang w:eastAsia="es-CO"/>
         </w:rPr>
-        <w:t xml:space="preserve"> </w:t>
-      </w:r>
-      <w:r>
+      </w:pPr>
+    </w:p>
+    <w:p>
+      <w:pPr>
+        <w:jc w:val="center"/>
         <w:rPr>
           <w:rFonts w:eastAsia="Times New Roman" w:cs="Times New Roman"/>
           <w:szCs w:val="24"/>
           <w:lang w:eastAsia="es-CO"/>
         </w:rPr>
-        <w:t>24/02/2025</w:t>
-      </w:r>
+      </w:pPr>
     </w:p>
     <w:p>
       <w:pPr>
@@ -245,24 +261,24 @@
           <w:lang w:eastAsia="es-CO"/>
         </w:rPr>
       </w:pPr>
-    </w:p>
-    <w:p>
-      <w:pPr>
-        <w:jc w:val="center"/>
+      <w:r>
         <w:rPr>
           <w:rFonts w:eastAsia="Times New Roman" w:cs="Times New Roman"/>
           <w:szCs w:val="24"/>
           <w:lang w:eastAsia="es-CO"/>
         </w:rPr>
-      </w:pPr>
-      <w:r>
+        <w:t>Bogotá D.C. 24/02/2025</w:t>
+      </w:r>
+    </w:p>
+    <w:p>
+      <w:pPr>
+        <w:jc w:val="center"/>
         <w:rPr>
           <w:rFonts w:eastAsia="Times New Roman" w:cs="Times New Roman"/>
           <w:szCs w:val="24"/>
           <w:lang w:eastAsia="es-CO"/>
         </w:rPr>
-        <w:t>Instructora: Suárez Novoa Isaura María</w:t>
-      </w:r>
+      </w:pPr>
     </w:p>
     <w:p>
       <w:pPr>
@@ -273,16 +289,14 @@
           <w:lang w:eastAsia="es-CO"/>
         </w:rPr>
       </w:pPr>
-    </w:p>
-    <w:p>
-      <w:pPr>
-        <w:jc w:val="center"/>
+      <w:r>
         <w:rPr>
           <w:rFonts w:eastAsia="Times New Roman" w:cs="Times New Roman"/>
           <w:szCs w:val="24"/>
           <w:lang w:eastAsia="es-CO"/>
         </w:rPr>
-      </w:pPr>
+        <w:t>Instructora: Suárez Novoa Isaura María</w:t>
+      </w:r>
     </w:p>
     <w:p>
       <w:pPr>
@@ -463,13 +477,7 @@
         <w:rPr>
           <w:rStyle w:val="Textoennegrita"/>
         </w:rPr>
-        <w:t>H</w:t>
-      </w:r>
-      <w:r>
-        <w:rPr>
-          <w:rStyle w:val="Textoennegrita"/>
-        </w:rPr>
-        <w:t>allazgos más importantes</w:t>
+        <w:t>Hallazgos más importantes</w:t>
       </w:r>
     </w:p>
     <w:p>
@@ -1048,7 +1056,7 @@
 </file>
 
 <file path=word/endnotes.xml><?xml version="1.0" encoding="utf-8"?>
-<w:endnotes xmlns:wpc="http://schemas.microsoft.com/office/word/2010/wordprocessingCanvas" xmlns:cx="http://schemas.microsoft.com/office/drawing/2014/chartex" xmlns:cx1="http://schemas.microsoft.com/office/drawing/2015/9/8/chartex" xmlns:cx2="http://schemas.microsoft.com/office/drawing/2015/10/21/chartex" xmlns:cx3="http://schemas.microsoft.com/office/drawing/2016/5/9/chartex" xmlns:cx4="http://schemas.microsoft.com/office/drawing/2016/5/10/chartex" xmlns:cx5="http://schemas.microsoft.com/office/drawing/2016/5/11/chartex" xmlns:cx6="http://schemas.microsoft.com/office/drawing/2016/5/12/chartex" xmlns:cx7="http://schemas.microsoft.com/office/drawing/2016/5/13/chartex" xmlns:cx8="http://schemas.microsoft.com/office/drawing/2016/5/14/chartex" xmlns:mc="http://schemas.openxmlformats.org/markup-compatibility/2006" xmlns:aink="http://schemas.microsoft.com/office/drawing/2016/ink" xmlns:am3d="http://schemas.microsoft.com/office/drawing/2017/model3d" xmlns:o="urn:schemas-microsoft-com:office:office" xmlns:oel="http://schemas.microsoft.com/office/2019/extlst" xmlns:r="http://schemas.openxmlformats.org/officeDocument/2006/relationships" xmlns:m="http://schemas.openxmlformats.org/officeDocument/2006/math" xmlns:v="urn:schemas-microsoft-com:vml" xmlns:wp14="http://schemas.microsoft.com/office/word/2010/wordprocessingDrawing" xmlns:wp="http://schemas.openxmlformats.org/drawingml/2006/wordprocessingDrawing" xmlns:w10="urn:schemas-microsoft-com:office:word" xmlns:w="http://schemas.openxmlformats.org/wordprocessingml/2006/main" xmlns:w14="http://schemas.microsoft.com/office/word/2010/wordml" xmlns:w15="http://schemas.microsoft.com/office/word/2012/wordml" xmlns:w16cex="http://schemas.microsoft.com/office/word/2018/wordml/cex" xmlns:w16cid="http://schemas.microsoft.com/office/word/2016/wordml/cid" xmlns:w16="http://schemas.microsoft.com/office/word/2018/wordml" xmlns:w16sdtdh="http://schemas.microsoft.com/office/word/2020/wordml/sdtdatahash" xmlns:w16se="http://schemas.microsoft.com/office/word/2015/wordml/symex" xmlns:wpg="http://schemas.microsoft.com/office/word/2010/wordprocessingGroup" xmlns:wpi="http://schemas.microsoft.com/office/word/2010/wordprocessingInk" xmlns:wne="http://schemas.microsoft.com/office/word/2006/wordml" xmlns:wps="http://schemas.microsoft.com/office/word/2010/wordprocessingShape" mc:Ignorable="w14 w15 w16se w16cid w16 w16cex w16sdtdh wp14">
+<w:endnotes xmlns:wpc="http://schemas.microsoft.com/office/word/2010/wordprocessingCanvas" xmlns:cx="http://schemas.microsoft.com/office/drawing/2014/chartex" xmlns:cx1="http://schemas.microsoft.com/office/drawing/2015/9/8/chartex" xmlns:cx2="http://schemas.microsoft.com/office/drawing/2015/10/21/chartex" xmlns:cx3="http://schemas.microsoft.com/office/drawing/2016/5/9/chartex" xmlns:cx4="http://schemas.microsoft.com/office/drawing/2016/5/10/chartex" xmlns:cx5="http://schemas.microsoft.com/office/drawing/2016/5/11/chartex" xmlns:cx6="http://schemas.microsoft.com/office/drawing/2016/5/12/chartex" xmlns:cx7="http://schemas.microsoft.com/office/drawing/2016/5/13/chartex" xmlns:cx8="http://schemas.microsoft.com/office/drawing/2016/5/14/chartex" xmlns:mc="http://schemas.openxmlformats.org/markup-compatibility/2006" xmlns:aink="http://schemas.microsoft.com/office/drawing/2016/ink" xmlns:am3d="http://schemas.microsoft.com/office/drawing/2017/model3d" xmlns:o="urn:schemas-microsoft-com:office:office" xmlns:oel="http://schemas.microsoft.com/office/2019/extlst" xmlns:r="http://schemas.openxmlformats.org/officeDocument/2006/relationships" xmlns:m="http://schemas.openxmlformats.org/officeDocument/2006/math" xmlns:v="urn:schemas-microsoft-com:vml" xmlns:wp14="http://schemas.microsoft.com/office/word/2010/wordprocessingDrawing" xmlns:wp="http://schemas.openxmlformats.org/drawingml/2006/wordprocessingDrawing" xmlns:w10="urn:schemas-microsoft-com:office:word" xmlns:w="http://schemas.openxmlformats.org/wordprocessingml/2006/main" xmlns:w14="http://schemas.microsoft.com/office/word/2010/wordml" xmlns:w15="http://schemas.microsoft.com/office/word/2012/wordml" xmlns:w16cex="http://schemas.microsoft.com/office/word/2018/wordml/cex" xmlns:w16cid="http://schemas.microsoft.com/office/word/2016/wordml/cid" xmlns:w16="http://schemas.microsoft.com/office/word/2018/wordml" xmlns:w16du="http://schemas.microsoft.com/office/word/2023/wordml/word16du" xmlns:w16sdtdh="http://schemas.microsoft.com/office/word/2020/wordml/sdtdatahash" xmlns:w16sdtfl="http://schemas.microsoft.com/office/word/2024/wordml/sdtformatlock" xmlns:w16se="http://schemas.microsoft.com/office/word/2015/wordml/symex" xmlns:wpg="http://schemas.microsoft.com/office/word/2010/wordprocessingGroup" xmlns:wpi="http://schemas.microsoft.com/office/word/2010/wordprocessingInk" xmlns:wne="http://schemas.microsoft.com/office/word/2006/wordml" xmlns:wps="http://schemas.microsoft.com/office/word/2010/wordprocessingShape" mc:Ignorable="w14 w15 w16se w16cid w16 w16cex w16sdtdh w16sdtfl w16du wp14">
   <w:endnote w:type="separator" w:id="-1">
     <w:p>
       <w:pPr>
@@ -1073,7 +1081,7 @@
 </file>
 
 <file path=word/footnotes.xml><?xml version="1.0" encoding="utf-8"?>
-<w:footnotes xmlns:wpc="http://schemas.microsoft.com/office/word/2010/wordprocessingCanvas" xmlns:cx="http://schemas.microsoft.com/office/drawing/2014/chartex" xmlns:cx1="http://schemas.microsoft.com/office/drawing/2015/9/8/chartex" xmlns:cx2="http://schemas.microsoft.com/office/drawing/2015/10/21/chartex" xmlns:cx3="http://schemas.microsoft.com/office/drawing/2016/5/9/chartex" xmlns:cx4="http://schemas.microsoft.com/office/drawing/2016/5/10/chartex" xmlns:cx5="http://schemas.microsoft.com/office/drawing/2016/5/11/chartex" xmlns:cx6="http://schemas.microsoft.com/office/drawing/2016/5/12/chartex" xmlns:cx7="http://schemas.microsoft.com/office/drawing/2016/5/13/chartex" xmlns:cx8="http://schemas.microsoft.com/office/drawing/2016/5/14/chartex" xmlns:mc="http://schemas.openxmlformats.org/markup-compatibility/2006" xmlns:aink="http://schemas.microsoft.com/office/drawing/2016/ink" xmlns:am3d="http://schemas.microsoft.com/office/drawing/2017/model3d" xmlns:o="urn:schemas-microsoft-com:office:office" xmlns:oel="http://schemas.microsoft.com/office/2019/extlst" xmlns:r="http://schemas.openxmlformats.org/officeDocument/2006/relationships" xmlns:m="http://schemas.openxmlformats.org/officeDocument/2006/math" xmlns:v="urn:schemas-microsoft-com:vml" xmlns:wp14="http://schemas.microsoft.com/office/word/2010/wordprocessingDrawing" xmlns:wp="http://schemas.openxmlformats.org/drawingml/2006/wordprocessingDrawing" xmlns:w10="urn:schemas-microsoft-com:office:word" xmlns:w="http://schemas.openxmlformats.org/wordprocessingml/2006/main" xmlns:w14="http://schemas.microsoft.com/office/word/2010/wordml" xmlns:w15="http://schemas.microsoft.com/office/word/2012/wordml" xmlns:w16cex="http://schemas.microsoft.com/office/word/2018/wordml/cex" xmlns:w16cid="http://schemas.microsoft.com/office/word/2016/wordml/cid" xmlns:w16="http://schemas.microsoft.com/office/word/2018/wordml" xmlns:w16sdtdh="http://schemas.microsoft.com/office/word/2020/wordml/sdtdatahash" xmlns:w16se="http://schemas.microsoft.com/office/word/2015/wordml/symex" xmlns:wpg="http://schemas.microsoft.com/office/word/2010/wordprocessingGroup" xmlns:wpi="http://schemas.microsoft.com/office/word/2010/wordprocessingInk" xmlns:wne="http://schemas.microsoft.com/office/word/2006/wordml" xmlns:wps="http://schemas.microsoft.com/office/word/2010/wordprocessingShape" mc:Ignorable="w14 w15 w16se w16cid w16 w16cex w16sdtdh wp14">
+<w:footnotes xmlns:wpc="http://schemas.microsoft.com/office/word/2010/wordprocessingCanvas" xmlns:cx="http://schemas.microsoft.com/office/drawing/2014/chartex" xmlns:cx1="http://schemas.microsoft.com/office/drawing/2015/9/8/chartex" xmlns:cx2="http://schemas.microsoft.com/office/drawing/2015/10/21/chartex" xmlns:cx3="http://schemas.microsoft.com/office/drawing/2016/5/9/chartex" xmlns:cx4="http://schemas.microsoft.com/office/drawing/2016/5/10/chartex" xmlns:cx5="http://schemas.microsoft.com/office/drawing/2016/5/11/chartex" xmlns:cx6="http://schemas.microsoft.com/office/drawing/2016/5/12/chartex" xmlns:cx7="http://schemas.microsoft.com/office/drawing/2016/5/13/chartex" xmlns:cx8="http://schemas.microsoft.com/office/drawing/2016/5/14/chartex" xmlns:mc="http://schemas.openxmlformats.org/markup-compatibility/2006" xmlns:aink="http://schemas.microsoft.com/office/drawing/2016/ink" xmlns:am3d="http://schemas.microsoft.com/office/drawing/2017/model3d" xmlns:o="urn:schemas-microsoft-com:office:office" xmlns:oel="http://schemas.microsoft.com/office/2019/extlst" xmlns:r="http://schemas.openxmlformats.org/officeDocument/2006/relationships" xmlns:m="http://schemas.openxmlformats.org/officeDocument/2006/math" xmlns:v="urn:schemas-microsoft-com:vml" xmlns:wp14="http://schemas.microsoft.com/office/word/2010/wordprocessingDrawing" xmlns:wp="http://schemas.openxmlformats.org/drawingml/2006/wordprocessingDrawing" xmlns:w10="urn:schemas-microsoft-com:office:word" xmlns:w="http://schemas.openxmlformats.org/wordprocessingml/2006/main" xmlns:w14="http://schemas.microsoft.com/office/word/2010/wordml" xmlns:w15="http://schemas.microsoft.com/office/word/2012/wordml" xmlns:w16cex="http://schemas.microsoft.com/office/word/2018/wordml/cex" xmlns:w16cid="http://schemas.microsoft.com/office/word/2016/wordml/cid" xmlns:w16="http://schemas.microsoft.com/office/word/2018/wordml" xmlns:w16du="http://schemas.microsoft.com/office/word/2023/wordml/word16du" xmlns:w16sdtdh="http://schemas.microsoft.com/office/word/2020/wordml/sdtdatahash" xmlns:w16sdtfl="http://schemas.microsoft.com/office/word/2024/wordml/sdtformatlock" xmlns:w16se="http://schemas.microsoft.com/office/word/2015/wordml/symex" xmlns:wpg="http://schemas.microsoft.com/office/word/2010/wordprocessingGroup" xmlns:wpi="http://schemas.microsoft.com/office/word/2010/wordprocessingInk" xmlns:wne="http://schemas.microsoft.com/office/word/2006/wordml" xmlns:wps="http://schemas.microsoft.com/office/word/2010/wordprocessingShape" mc:Ignorable="w14 w15 w16se w16cid w16 w16cex w16sdtdh w16sdtfl w16du wp14">
   <w:footnote w:type="separator" w:id="-1">
     <w:p>
       <w:pPr>
@@ -1098,7 +1106,7 @@
 </file>
 
 <file path=word/numbering.xml><?xml version="1.0" encoding="utf-8"?>
-<w:numbering xmlns:wpc="http://schemas.microsoft.com/office/word/2010/wordprocessingCanvas" xmlns:cx="http://schemas.microsoft.com/office/drawing/2014/chartex" xmlns:cx1="http://schemas.microsoft.com/office/drawing/2015/9/8/chartex" xmlns:cx2="http://schemas.microsoft.com/office/drawing/2015/10/21/chartex" xmlns:cx3="http://schemas.microsoft.com/office/drawing/2016/5/9/chartex" xmlns:cx4="http://schemas.microsoft.com/office/drawing/2016/5/10/chartex" xmlns:cx5="http://schemas.microsoft.com/office/drawing/2016/5/11/chartex" xmlns:cx6="http://schemas.microsoft.com/office/drawing/2016/5/12/chartex" xmlns:cx7="http://schemas.microsoft.com/office/drawing/2016/5/13/chartex" xmlns:cx8="http://schemas.microsoft.com/office/drawing/2016/5/14/chartex" xmlns:mc="http://schemas.openxmlformats.org/markup-compatibility/2006" xmlns:aink="http://schemas.microsoft.com/office/drawing/2016/ink" xmlns:am3d="http://schemas.microsoft.com/office/drawing/2017/model3d" xmlns:o="urn:schemas-microsoft-com:office:office" xmlns:oel="http://schemas.microsoft.com/office/2019/extlst" xmlns:r="http://schemas.openxmlformats.org/officeDocument/2006/relationships" xmlns:m="http://schemas.openxmlformats.org/officeDocument/2006/math" xmlns:v="urn:schemas-microsoft-com:vml" xmlns:wp14="http://schemas.microsoft.com/office/word/2010/wordprocessingDrawing" xmlns:wp="http://schemas.openxmlformats.org/drawingml/2006/wordprocessingDrawing" xmlns:w10="urn:schemas-microsoft-com:office:word" xmlns:w="http://schemas.openxmlformats.org/wordprocessingml/2006/main" xmlns:w14="http://schemas.microsoft.com/office/word/2010/wordml" xmlns:w15="http://schemas.microsoft.com/office/word/2012/wordml" xmlns:w16cex="http://schemas.microsoft.com/office/word/2018/wordml/cex" xmlns:w16cid="http://schemas.microsoft.com/office/word/2016/wordml/cid" xmlns:w16="http://schemas.microsoft.com/office/word/2018/wordml" xmlns:w16sdtdh="http://schemas.microsoft.com/office/word/2020/wordml/sdtdatahash" xmlns:w16se="http://schemas.microsoft.com/office/word/2015/wordml/symex" xmlns:wpg="http://schemas.microsoft.com/office/word/2010/wordprocessingGroup" xmlns:wpi="http://schemas.microsoft.com/office/word/2010/wordprocessingInk" xmlns:wne="http://schemas.microsoft.com/office/word/2006/wordml" xmlns:wps="http://schemas.microsoft.com/office/word/2010/wordprocessingShape" mc:Ignorable="w14 w15 w16se w16cid w16 w16cex w16sdtdh wp14">
+<w:numbering xmlns:wpc="http://schemas.microsoft.com/office/word/2010/wordprocessingCanvas" xmlns:cx="http://schemas.microsoft.com/office/drawing/2014/chartex" xmlns:cx1="http://schemas.microsoft.com/office/drawing/2015/9/8/chartex" xmlns:cx2="http://schemas.microsoft.com/office/drawing/2015/10/21/chartex" xmlns:cx3="http://schemas.microsoft.com/office/drawing/2016/5/9/chartex" xmlns:cx4="http://schemas.microsoft.com/office/drawing/2016/5/10/chartex" xmlns:cx5="http://schemas.microsoft.com/office/drawing/2016/5/11/chartex" xmlns:cx6="http://schemas.microsoft.com/office/drawing/2016/5/12/chartex" xmlns:cx7="http://schemas.microsoft.com/office/drawing/2016/5/13/chartex" xmlns:cx8="http://schemas.microsoft.com/office/drawing/2016/5/14/chartex" xmlns:mc="http://schemas.openxmlformats.org/markup-compatibility/2006" xmlns:aink="http://schemas.microsoft.com/office/drawing/2016/ink" xmlns:am3d="http://schemas.microsoft.com/office/drawing/2017/model3d" xmlns:o="urn:schemas-microsoft-com:office:office" xmlns:oel="http://schemas.microsoft.com/office/2019/extlst" xmlns:r="http://schemas.openxmlformats.org/officeDocument/2006/relationships" xmlns:m="http://schemas.openxmlformats.org/officeDocument/2006/math" xmlns:v="urn:schemas-microsoft-com:vml" xmlns:wp14="http://schemas.microsoft.com/office/word/2010/wordprocessingDrawing" xmlns:wp="http://schemas.openxmlformats.org/drawingml/2006/wordprocessingDrawing" xmlns:w10="urn:schemas-microsoft-com:office:word" xmlns:w="http://schemas.openxmlformats.org/wordprocessingml/2006/main" xmlns:w14="http://schemas.microsoft.com/office/word/2010/wordml" xmlns:w15="http://schemas.microsoft.com/office/word/2012/wordml" xmlns:w16cex="http://schemas.microsoft.com/office/word/2018/wordml/cex" xmlns:w16cid="http://schemas.microsoft.com/office/word/2016/wordml/cid" xmlns:w16="http://schemas.microsoft.com/office/word/2018/wordml" xmlns:w16du="http://schemas.microsoft.com/office/word/2023/wordml/word16du" xmlns:w16sdtdh="http://schemas.microsoft.com/office/word/2020/wordml/sdtdatahash" xmlns:w16sdtfl="http://schemas.microsoft.com/office/word/2024/wordml/sdtformatlock" xmlns:w16se="http://schemas.microsoft.com/office/word/2015/wordml/symex" xmlns:wpg="http://schemas.microsoft.com/office/word/2010/wordprocessingGroup" xmlns:wpi="http://schemas.microsoft.com/office/word/2010/wordprocessingInk" xmlns:wne="http://schemas.microsoft.com/office/word/2006/wordml" xmlns:wps="http://schemas.microsoft.com/office/word/2010/wordprocessingShape" mc:Ignorable="w14 w15 w16se w16cid w16 w16cex w16sdtdh w16sdtfl w16du wp14">
   <w:abstractNum w:abstractNumId="0" w15:restartNumberingAfterBreak="0">
     <w:nsid w:val="03DC489C"/>
     <w:multiLevelType w:val="multilevel"/>
@@ -2319,7 +2327,7 @@
 </file>
 
 <file path=word/styles.xml><?xml version="1.0" encoding="utf-8"?>
-<w:styles xmlns:mc="http://schemas.openxmlformats.org/markup-compatibility/2006" xmlns:r="http://schemas.openxmlformats.org/officeDocument/2006/relationships" xmlns:w="http://schemas.openxmlformats.org/wordprocessingml/2006/main" xmlns:w14="http://schemas.microsoft.com/office/word/2010/wordml" xmlns:w15="http://schemas.microsoft.com/office/word/2012/wordml" xmlns:w16cex="http://schemas.microsoft.com/office/word/2018/wordml/cex" xmlns:w16cid="http://schemas.microsoft.com/office/word/2016/wordml/cid" xmlns:w16="http://schemas.microsoft.com/office/word/2018/wordml" xmlns:w16sdtdh="http://schemas.microsoft.com/office/word/2020/wordml/sdtdatahash" xmlns:w16se="http://schemas.microsoft.com/office/word/2015/wordml/symex" mc:Ignorable="w14 w15 w16se w16cid w16 w16cex w16sdtdh">
+<w:styles xmlns:mc="http://schemas.openxmlformats.org/markup-compatibility/2006" xmlns:r="http://schemas.openxmlformats.org/officeDocument/2006/relationships" xmlns:w="http://schemas.openxmlformats.org/wordprocessingml/2006/main" xmlns:w14="http://schemas.microsoft.com/office/word/2010/wordml" xmlns:w15="http://schemas.microsoft.com/office/word/2012/wordml" xmlns:w16cex="http://schemas.microsoft.com/office/word/2018/wordml/cex" xmlns:w16cid="http://schemas.microsoft.com/office/word/2016/wordml/cid" xmlns:w16="http://schemas.microsoft.com/office/word/2018/wordml" xmlns:w16du="http://schemas.microsoft.com/office/word/2023/wordml/word16du" xmlns:w16sdtdh="http://schemas.microsoft.com/office/word/2020/wordml/sdtdatahash" xmlns:w16sdtfl="http://schemas.microsoft.com/office/word/2024/wordml/sdtformatlock" xmlns:w16se="http://schemas.microsoft.com/office/word/2015/wordml/symex" mc:Ignorable="w14 w15 w16se w16cid w16 w16cex w16sdtdh w16sdtfl w16du">
   <w:docDefaults>
     <w:rPrDefault>
       <w:rPr>
@@ -2441,6 +2449,7 @@
     <w:lsdException w:name="HTML Sample" w:semiHidden="1" w:unhideWhenUsed="1"/>
     <w:lsdException w:name="HTML Typewriter" w:semiHidden="1" w:unhideWhenUsed="1"/>
     <w:lsdException w:name="HTML Variable" w:semiHidden="1" w:unhideWhenUsed="1"/>
+    <w:lsdException w:name="Normal Table" w:semiHidden="1" w:unhideWhenUsed="1"/>
     <w:lsdException w:name="annotation subject" w:semiHidden="1" w:unhideWhenUsed="1"/>
     <w:lsdException w:name="No List" w:semiHidden="1" w:unhideWhenUsed="1"/>
     <w:lsdException w:name="Outline List 1" w:semiHidden="1" w:unhideWhenUsed="1"/>
@@ -2487,8 +2496,10 @@
     <w:lsdException w:name="Table Subtle 2" w:semiHidden="1" w:unhideWhenUsed="1"/>
     <w:lsdException w:name="Table Web 1" w:semiHidden="1" w:unhideWhenUsed="1"/>
     <w:lsdException w:name="Table Web 2" w:semiHidden="1" w:unhideWhenUsed="1"/>
+    <w:lsdException w:name="Table Web 3" w:semiHidden="1" w:unhideWhenUsed="1"/>
     <w:lsdException w:name="Balloon Text" w:semiHidden="1" w:unhideWhenUsed="1"/>
     <w:lsdException w:name="Table Grid" w:uiPriority="39"/>
+    <w:lsdException w:name="Table Theme" w:semiHidden="1" w:unhideWhenUsed="1"/>
     <w:lsdException w:name="Placeholder Text" w:semiHidden="1"/>
     <w:lsdException w:name="No Spacing" w:uiPriority="1" w:qFormat="1"/>
     <w:lsdException w:name="Light Shading" w:uiPriority="60"/>

</xml_diff>